<commit_message>
Update Smart Greenhouse Report final docs
Update both .docx and .pdf versions of the Smart Greenhouse Report Final documentation.
</commit_message>
<xml_diff>
--- a/docs/Smart_Greenhouse_Report_Final.docx
+++ b/docs/Smart_Greenhouse_Report_Final.docx
@@ -2908,8 +2908,768 @@
         <w:spacing w:after="120" w:line="259" w:lineRule="auto"/>
       </w:pPr>
       <w:r>
-        <w:t>The safety node reads gas/smoke and flame data. When a dangerous situation is detected, the node can switch local warning outputs such as buzzer and RGB LED and also publish alarm information to the Raspberry Pi. This separates safety monitoring from the environment node and keeps the design modular.</w:t>
+        <w:t xml:space="preserve">The safety node reads gas/smoke and flame data. When a dangerous situation is detected, the node can switch local warning outputs such as buzzer and RGB LED and also publish alarm information to the Raspberry Pi. This separates safety monitoring from the </w:t>
       </w:r>
+      <w:proofErr w:type="gramStart"/>
+      <w:r>
+        <w:t>environment node</w:t>
+      </w:r>
+      <w:proofErr w:type="gramEnd"/>
+      <w:r>
+        <w:t xml:space="preserve"> and keeps the design modular.</w:t>
+      </w:r>
+    </w:p>
+    <w:p>
+      <w:pPr>
+        <w:spacing w:before="240" w:after="240"/>
+      </w:pPr>
+      <w:r>
+        <w:rPr>
+          <w:rFonts w:cs="Arial"/>
+          <w:szCs w:val="21"/>
+        </w:rPr>
+        <w:t xml:space="preserve">The safety node is a modular part of the system that constantly checks the greenhouse for hazards. We kept the safety monitoring separate from the regular environment monitoring so it can react instantly. If there is a danger, it triggers the buzzer and warning lights right away. In this version, we used an Arduino Uno </w:t>
+      </w:r>
+      <w:proofErr w:type="spellStart"/>
+      <w:r>
+        <w:rPr>
+          <w:rFonts w:cs="Arial"/>
+          <w:szCs w:val="21"/>
+        </w:rPr>
+        <w:t>WiFi</w:t>
+      </w:r>
+      <w:proofErr w:type="spellEnd"/>
+      <w:r>
+        <w:rPr>
+          <w:rFonts w:cs="Arial"/>
+          <w:szCs w:val="21"/>
+        </w:rPr>
+        <w:t xml:space="preserve"> Rev2. The Arduino handles reading the sensors, deciding if there is an emergency, and sending the data over MQTT.</w:t>
+      </w:r>
+    </w:p>
+    <w:p>
+      <w:pPr>
+        <w:spacing w:before="240" w:after="240"/>
+        <w:rPr>
+          <w:rFonts w:cs="Arial"/>
+          <w:szCs w:val="21"/>
+        </w:rPr>
+      </w:pPr>
+      <w:r>
+        <w:rPr>
+          <w:rFonts w:cs="Arial"/>
+          <w:szCs w:val="21"/>
+        </w:rPr>
+        <w:t xml:space="preserve">For the hardware, the node uses an MQ-2 sensor to detect gas and smoke, along with a KY-026 flame sensor to watch for the infrared light made by open fires. For local warnings in the room, it uses a KY-006 buzzer and an LED light. The node also sends </w:t>
+      </w:r>
+      <w:proofErr w:type="gramStart"/>
+      <w:r>
+        <w:rPr>
+          <w:rFonts w:cs="Arial"/>
+          <w:szCs w:val="21"/>
+        </w:rPr>
+        <w:t>all of</w:t>
+      </w:r>
+      <w:proofErr w:type="gramEnd"/>
+      <w:r>
+        <w:rPr>
+          <w:rFonts w:cs="Arial"/>
+          <w:szCs w:val="21"/>
+        </w:rPr>
+        <w:t xml:space="preserve"> its data straight to the Raspberry Pi using three specific MQTT topics:</w:t>
+      </w:r>
+    </w:p>
+    <w:p>
+      <w:pPr>
+        <w:spacing w:before="240" w:after="240"/>
+      </w:pPr>
+    </w:p>
+    <w:tbl>
+      <w:tblPr>
+        <w:tblStyle w:val="TableGrid"/>
+        <w:tblW w:w="0" w:type="auto"/>
+        <w:jc w:val="center"/>
+        <w:tblLook w:val="04A0" w:firstRow="1" w:lastRow="0" w:firstColumn="1" w:lastColumn="0" w:noHBand="0" w:noVBand="1"/>
+      </w:tblPr>
+      <w:tblGrid>
+        <w:gridCol w:w="3229"/>
+        <w:gridCol w:w="3567"/>
+        <w:gridCol w:w="3644"/>
+      </w:tblGrid>
+      <w:tr>
+        <w:trPr>
+          <w:trHeight w:val="300"/>
+          <w:jc w:val="center"/>
+        </w:trPr>
+        <w:tc>
+          <w:tcPr>
+            <w:tcW w:w="3229" w:type="dxa"/>
+            <w:shd w:val="clear" w:color="auto" w:fill="D9EAD3"/>
+            <w:vAlign w:val="center"/>
+          </w:tcPr>
+          <w:p>
+            <w:pPr>
+              <w:rPr>
+                <w:rFonts w:cs="Arial"/>
+                <w:b/>
+                <w:bCs/>
+                <w:sz w:val="19"/>
+                <w:szCs w:val="19"/>
+              </w:rPr>
+            </w:pPr>
+            <w:r>
+              <w:rPr>
+                <w:rFonts w:cs="Arial"/>
+                <w:b/>
+                <w:bCs/>
+                <w:sz w:val="19"/>
+                <w:szCs w:val="19"/>
+              </w:rPr>
+              <w:t>Published Value</w:t>
+            </w:r>
+          </w:p>
+        </w:tc>
+        <w:tc>
+          <w:tcPr>
+            <w:tcW w:w="3567" w:type="dxa"/>
+            <w:shd w:val="clear" w:color="auto" w:fill="D9EAD3"/>
+            <w:vAlign w:val="center"/>
+          </w:tcPr>
+          <w:p>
+            <w:pPr>
+              <w:rPr>
+                <w:rFonts w:cs="Arial"/>
+                <w:b/>
+                <w:bCs/>
+                <w:sz w:val="19"/>
+                <w:szCs w:val="19"/>
+              </w:rPr>
+            </w:pPr>
+            <w:r>
+              <w:rPr>
+                <w:rFonts w:cs="Arial"/>
+                <w:b/>
+                <w:bCs/>
+                <w:sz w:val="19"/>
+                <w:szCs w:val="19"/>
+              </w:rPr>
+              <w:t>MQTT Topic</w:t>
+            </w:r>
+          </w:p>
+        </w:tc>
+        <w:tc>
+          <w:tcPr>
+            <w:tcW w:w="3644" w:type="dxa"/>
+            <w:shd w:val="clear" w:color="auto" w:fill="D9EAD3"/>
+            <w:vAlign w:val="center"/>
+          </w:tcPr>
+          <w:p>
+            <w:pPr>
+              <w:rPr>
+                <w:rFonts w:cs="Arial"/>
+                <w:b/>
+                <w:bCs/>
+                <w:sz w:val="19"/>
+                <w:szCs w:val="19"/>
+              </w:rPr>
+            </w:pPr>
+            <w:r>
+              <w:rPr>
+                <w:rFonts w:cs="Arial"/>
+                <w:b/>
+                <w:bCs/>
+                <w:sz w:val="19"/>
+                <w:szCs w:val="19"/>
+              </w:rPr>
+              <w:t>Safety Node Interpretation</w:t>
+            </w:r>
+          </w:p>
+        </w:tc>
+      </w:tr>
+      <w:tr>
+        <w:trPr>
+          <w:trHeight w:val="300"/>
+          <w:jc w:val="center"/>
+        </w:trPr>
+        <w:tc>
+          <w:tcPr>
+            <w:tcW w:w="3229" w:type="dxa"/>
+          </w:tcPr>
+          <w:p>
+            <w:r>
+              <w:rPr>
+                <w:rFonts w:cs="Arial"/>
+                <w:sz w:val="19"/>
+                <w:szCs w:val="19"/>
+              </w:rPr>
+              <w:t>Gas / Smoke Value</w:t>
+            </w:r>
+          </w:p>
+        </w:tc>
+        <w:tc>
+          <w:tcPr>
+            <w:tcW w:w="3567" w:type="dxa"/>
+          </w:tcPr>
+          <w:p>
+            <w:r>
+              <w:rPr>
+                <w:rFonts w:cs="Arial"/>
+                <w:sz w:val="19"/>
+                <w:szCs w:val="19"/>
+              </w:rPr>
+              <w:t>greenhouse/smoke</w:t>
+            </w:r>
+          </w:p>
+        </w:tc>
+        <w:tc>
+          <w:tcPr>
+            <w:tcW w:w="3644" w:type="dxa"/>
+          </w:tcPr>
+          <w:p>
+            <w:r>
+              <w:rPr>
+                <w:rFonts w:cs="Arial"/>
+                <w:sz w:val="19"/>
+                <w:szCs w:val="19"/>
+              </w:rPr>
+              <w:t>Raw sensor value for gas or smoke concentration</w:t>
+            </w:r>
+          </w:p>
+        </w:tc>
+      </w:tr>
+      <w:tr>
+        <w:trPr>
+          <w:trHeight w:val="300"/>
+          <w:jc w:val="center"/>
+        </w:trPr>
+        <w:tc>
+          <w:tcPr>
+            <w:tcW w:w="3229" w:type="dxa"/>
+          </w:tcPr>
+          <w:p>
+            <w:r>
+              <w:rPr>
+                <w:rFonts w:cs="Arial"/>
+                <w:sz w:val="19"/>
+                <w:szCs w:val="19"/>
+              </w:rPr>
+              <w:t>Flame Detection</w:t>
+            </w:r>
+          </w:p>
+        </w:tc>
+        <w:tc>
+          <w:tcPr>
+            <w:tcW w:w="3567" w:type="dxa"/>
+          </w:tcPr>
+          <w:p>
+            <w:r>
+              <w:rPr>
+                <w:rFonts w:cs="Arial"/>
+                <w:sz w:val="19"/>
+                <w:szCs w:val="19"/>
+              </w:rPr>
+              <w:t>greenhouse/flame</w:t>
+            </w:r>
+          </w:p>
+        </w:tc>
+        <w:tc>
+          <w:tcPr>
+            <w:tcW w:w="3644" w:type="dxa"/>
+          </w:tcPr>
+          <w:p>
+            <w:r>
+              <w:rPr>
+                <w:rFonts w:cs="Arial"/>
+                <w:sz w:val="19"/>
+                <w:szCs w:val="19"/>
+              </w:rPr>
+              <w:t>Current flame detection state or raw analog value</w:t>
+            </w:r>
+          </w:p>
+        </w:tc>
+      </w:tr>
+      <w:tr>
+        <w:trPr>
+          <w:trHeight w:val="300"/>
+          <w:jc w:val="center"/>
+        </w:trPr>
+        <w:tc>
+          <w:tcPr>
+            <w:tcW w:w="3229" w:type="dxa"/>
+          </w:tcPr>
+          <w:p>
+            <w:r>
+              <w:rPr>
+                <w:rFonts w:cs="Arial"/>
+                <w:sz w:val="19"/>
+                <w:szCs w:val="19"/>
+              </w:rPr>
+              <w:t>Alarm Status</w:t>
+            </w:r>
+          </w:p>
+        </w:tc>
+        <w:tc>
+          <w:tcPr>
+            <w:tcW w:w="3567" w:type="dxa"/>
+          </w:tcPr>
+          <w:p>
+            <w:r>
+              <w:rPr>
+                <w:rFonts w:cs="Arial"/>
+                <w:sz w:val="19"/>
+                <w:szCs w:val="19"/>
+              </w:rPr>
+              <w:t>greenhouse/alarm</w:t>
+            </w:r>
+          </w:p>
+        </w:tc>
+        <w:tc>
+          <w:tcPr>
+            <w:tcW w:w="3644" w:type="dxa"/>
+          </w:tcPr>
+          <w:p>
+            <w:r>
+              <w:rPr>
+                <w:rFonts w:cs="Arial"/>
+                <w:sz w:val="19"/>
+                <w:szCs w:val="19"/>
+              </w:rPr>
+              <w:t>Evaluated safety status message sent to the central controller</w:t>
+            </w:r>
+          </w:p>
+        </w:tc>
+      </w:tr>
+    </w:tbl>
+    <w:p>
+      <w:pPr>
+        <w:spacing w:before="240" w:after="240"/>
+      </w:pPr>
+      <w:r>
+        <w:rPr>
+          <w:rFonts w:cs="Arial"/>
+          <w:szCs w:val="21"/>
+        </w:rPr>
+        <w:t xml:space="preserve">We can tell the Arduino Rev2 is working and connected properly via MQTT because its data shows up perfectly in the central CSV log. A snippet from the CSV file shows </w:t>
+      </w:r>
+      <w:proofErr w:type="gramStart"/>
+      <w:r>
+        <w:rPr>
+          <w:rFonts w:cs="Arial"/>
+          <w:szCs w:val="21"/>
+        </w:rPr>
+        <w:t>that,</w:t>
+      </w:r>
+      <w:proofErr w:type="gramEnd"/>
+      <w:r>
+        <w:rPr>
+          <w:rFonts w:cs="Arial"/>
+          <w:szCs w:val="21"/>
+        </w:rPr>
+        <w:t xml:space="preserve"> the safety node sending live updates to the Raspberry Pi right alongside the environment node. The data shows that, the Arduino reporting the smoke level, a flame detection state, and successfully sending an active alarm state to the central dashboard:</w:t>
+      </w:r>
+    </w:p>
+    <w:tbl>
+      <w:tblPr>
+        <w:tblStyle w:val="TableGrid"/>
+        <w:tblW w:w="0" w:type="auto"/>
+        <w:jc w:val="center"/>
+        <w:tblLook w:val="04A0" w:firstRow="1" w:lastRow="0" w:firstColumn="1" w:lastColumn="0" w:noHBand="0" w:noVBand="1"/>
+      </w:tblPr>
+      <w:tblGrid>
+        <w:gridCol w:w="3229"/>
+        <w:gridCol w:w="3567"/>
+        <w:gridCol w:w="3644"/>
+      </w:tblGrid>
+      <w:tr>
+        <w:trPr>
+          <w:trHeight w:val="300"/>
+          <w:jc w:val="center"/>
+        </w:trPr>
+        <w:tc>
+          <w:tcPr>
+            <w:tcW w:w="3229" w:type="dxa"/>
+            <w:shd w:val="clear" w:color="auto" w:fill="D9EAD3"/>
+            <w:vAlign w:val="center"/>
+          </w:tcPr>
+          <w:p>
+            <w:r>
+              <w:rPr>
+                <w:b/>
+                <w:bCs/>
+              </w:rPr>
+              <w:t>Timestamp</w:t>
+            </w:r>
+          </w:p>
+        </w:tc>
+        <w:tc>
+          <w:tcPr>
+            <w:tcW w:w="3567" w:type="dxa"/>
+            <w:shd w:val="clear" w:color="auto" w:fill="D9EAD3"/>
+            <w:vAlign w:val="center"/>
+          </w:tcPr>
+          <w:p>
+            <w:pPr>
+              <w:rPr>
+                <w:rFonts w:cs="Arial"/>
+                <w:b/>
+                <w:bCs/>
+                <w:sz w:val="19"/>
+                <w:szCs w:val="19"/>
+              </w:rPr>
+            </w:pPr>
+            <w:r>
+              <w:rPr>
+                <w:rFonts w:cs="Arial"/>
+                <w:b/>
+                <w:bCs/>
+                <w:sz w:val="19"/>
+                <w:szCs w:val="19"/>
+              </w:rPr>
+              <w:t>Topic</w:t>
+            </w:r>
+          </w:p>
+        </w:tc>
+        <w:tc>
+          <w:tcPr>
+            <w:tcW w:w="3644" w:type="dxa"/>
+            <w:shd w:val="clear" w:color="auto" w:fill="D9EAD3"/>
+            <w:vAlign w:val="center"/>
+          </w:tcPr>
+          <w:p>
+            <w:pPr>
+              <w:rPr>
+                <w:rFonts w:cs="Arial"/>
+                <w:b/>
+                <w:bCs/>
+                <w:sz w:val="19"/>
+                <w:szCs w:val="19"/>
+              </w:rPr>
+            </w:pPr>
+            <w:r>
+              <w:rPr>
+                <w:rFonts w:cs="Arial"/>
+                <w:b/>
+                <w:bCs/>
+                <w:sz w:val="19"/>
+                <w:szCs w:val="19"/>
+              </w:rPr>
+              <w:t>Value</w:t>
+            </w:r>
+          </w:p>
+        </w:tc>
+      </w:tr>
+      <w:tr>
+        <w:trPr>
+          <w:trHeight w:val="300"/>
+          <w:jc w:val="center"/>
+        </w:trPr>
+        <w:tc>
+          <w:tcPr>
+            <w:tcW w:w="3229" w:type="dxa"/>
+          </w:tcPr>
+          <w:p>
+            <w:r>
+              <w:rPr>
+                <w:rFonts w:cs="Arial"/>
+                <w:sz w:val="19"/>
+                <w:szCs w:val="19"/>
+              </w:rPr>
+              <w:t>2026-06-10 13:56:11</w:t>
+            </w:r>
+          </w:p>
+        </w:tc>
+        <w:tc>
+          <w:tcPr>
+            <w:tcW w:w="3567" w:type="dxa"/>
+          </w:tcPr>
+          <w:p>
+            <w:r>
+              <w:rPr>
+                <w:rFonts w:cs="Arial"/>
+                <w:sz w:val="19"/>
+                <w:szCs w:val="19"/>
+              </w:rPr>
+              <w:t>greenhouse/temperature</w:t>
+            </w:r>
+          </w:p>
+        </w:tc>
+        <w:tc>
+          <w:tcPr>
+            <w:tcW w:w="3644" w:type="dxa"/>
+          </w:tcPr>
+          <w:p>
+            <w:r>
+              <w:rPr>
+                <w:rFonts w:cs="Arial"/>
+                <w:sz w:val="19"/>
+                <w:szCs w:val="19"/>
+              </w:rPr>
+              <w:t>24.5</w:t>
+            </w:r>
+          </w:p>
+        </w:tc>
+      </w:tr>
+      <w:tr>
+        <w:trPr>
+          <w:trHeight w:val="300"/>
+          <w:jc w:val="center"/>
+        </w:trPr>
+        <w:tc>
+          <w:tcPr>
+            <w:tcW w:w="3229" w:type="dxa"/>
+          </w:tcPr>
+          <w:p>
+            <w:r>
+              <w:rPr>
+                <w:rFonts w:cs="Arial"/>
+                <w:sz w:val="19"/>
+                <w:szCs w:val="19"/>
+              </w:rPr>
+              <w:t>2026-06-10 13:56:11</w:t>
+            </w:r>
+          </w:p>
+        </w:tc>
+        <w:tc>
+          <w:tcPr>
+            <w:tcW w:w="3567" w:type="dxa"/>
+          </w:tcPr>
+          <w:p>
+            <w:r>
+              <w:rPr>
+                <w:rFonts w:cs="Arial"/>
+                <w:sz w:val="19"/>
+                <w:szCs w:val="19"/>
+              </w:rPr>
+              <w:t>greenhouse/humidity</w:t>
+            </w:r>
+          </w:p>
+        </w:tc>
+        <w:tc>
+          <w:tcPr>
+            <w:tcW w:w="3644" w:type="dxa"/>
+          </w:tcPr>
+          <w:p>
+            <w:r>
+              <w:rPr>
+                <w:rFonts w:cs="Arial"/>
+                <w:sz w:val="19"/>
+                <w:szCs w:val="19"/>
+              </w:rPr>
+              <w:t>62.0</w:t>
+            </w:r>
+          </w:p>
+        </w:tc>
+      </w:tr>
+      <w:tr>
+        <w:trPr>
+          <w:trHeight w:val="300"/>
+          <w:jc w:val="center"/>
+        </w:trPr>
+        <w:tc>
+          <w:tcPr>
+            <w:tcW w:w="3229" w:type="dxa"/>
+          </w:tcPr>
+          <w:p>
+            <w:r>
+              <w:rPr>
+                <w:rFonts w:cs="Arial"/>
+                <w:sz w:val="19"/>
+                <w:szCs w:val="19"/>
+              </w:rPr>
+              <w:t>2026-06-10 13:56:11</w:t>
+            </w:r>
+          </w:p>
+        </w:tc>
+        <w:tc>
+          <w:tcPr>
+            <w:tcW w:w="3567" w:type="dxa"/>
+          </w:tcPr>
+          <w:p>
+            <w:r>
+              <w:rPr>
+                <w:rFonts w:cs="Arial"/>
+                <w:sz w:val="19"/>
+                <w:szCs w:val="19"/>
+              </w:rPr>
+              <w:t>greenhouse/smoke</w:t>
+            </w:r>
+          </w:p>
+        </w:tc>
+        <w:tc>
+          <w:tcPr>
+            <w:tcW w:w="3644" w:type="dxa"/>
+          </w:tcPr>
+          <w:p>
+            <w:r>
+              <w:rPr>
+                <w:rFonts w:cs="Arial"/>
+                <w:sz w:val="19"/>
+                <w:szCs w:val="19"/>
+              </w:rPr>
+              <w:t>350</w:t>
+            </w:r>
+          </w:p>
+        </w:tc>
+      </w:tr>
+      <w:tr>
+        <w:trPr>
+          <w:trHeight w:val="300"/>
+          <w:jc w:val="center"/>
+        </w:trPr>
+        <w:tc>
+          <w:tcPr>
+            <w:tcW w:w="3229" w:type="dxa"/>
+          </w:tcPr>
+          <w:p>
+            <w:r>
+              <w:rPr>
+                <w:rFonts w:cs="Arial"/>
+                <w:sz w:val="19"/>
+                <w:szCs w:val="19"/>
+              </w:rPr>
+              <w:t>2026-06-10 13:56:12</w:t>
+            </w:r>
+          </w:p>
+        </w:tc>
+        <w:tc>
+          <w:tcPr>
+            <w:tcW w:w="3567" w:type="dxa"/>
+          </w:tcPr>
+          <w:p>
+            <w:r>
+              <w:rPr>
+                <w:rFonts w:cs="Arial"/>
+                <w:sz w:val="19"/>
+                <w:szCs w:val="19"/>
+              </w:rPr>
+              <w:t>greenhouse/flame</w:t>
+            </w:r>
+          </w:p>
+        </w:tc>
+        <w:tc>
+          <w:tcPr>
+            <w:tcW w:w="3644" w:type="dxa"/>
+          </w:tcPr>
+          <w:p>
+            <w:r>
+              <w:rPr>
+                <w:rFonts w:cs="Arial"/>
+                <w:sz w:val="19"/>
+                <w:szCs w:val="19"/>
+              </w:rPr>
+              <w:t>1</w:t>
+            </w:r>
+          </w:p>
+        </w:tc>
+      </w:tr>
+      <w:tr>
+        <w:trPr>
+          <w:trHeight w:val="300"/>
+          <w:jc w:val="center"/>
+        </w:trPr>
+        <w:tc>
+          <w:tcPr>
+            <w:tcW w:w="3229" w:type="dxa"/>
+          </w:tcPr>
+          <w:p>
+            <w:r>
+              <w:rPr>
+                <w:rFonts w:cs="Arial"/>
+                <w:sz w:val="19"/>
+                <w:szCs w:val="19"/>
+              </w:rPr>
+              <w:lastRenderedPageBreak/>
+              <w:t>2026-06-10 13:56:12</w:t>
+            </w:r>
+          </w:p>
+        </w:tc>
+        <w:tc>
+          <w:tcPr>
+            <w:tcW w:w="3567" w:type="dxa"/>
+          </w:tcPr>
+          <w:p>
+            <w:r>
+              <w:rPr>
+                <w:rFonts w:cs="Arial"/>
+                <w:sz w:val="19"/>
+                <w:szCs w:val="19"/>
+              </w:rPr>
+              <w:t>greenhouse/rotation</w:t>
+            </w:r>
+          </w:p>
+        </w:tc>
+        <w:tc>
+          <w:tcPr>
+            <w:tcW w:w="3644" w:type="dxa"/>
+          </w:tcPr>
+          <w:p>
+            <w:r>
+              <w:rPr>
+                <w:rFonts w:cs="Arial"/>
+                <w:sz w:val="19"/>
+                <w:szCs w:val="19"/>
+              </w:rPr>
+              <w:t>30</w:t>
+            </w:r>
+          </w:p>
+        </w:tc>
+      </w:tr>
+      <w:tr>
+        <w:trPr>
+          <w:trHeight w:val="300"/>
+          <w:jc w:val="center"/>
+        </w:trPr>
+        <w:tc>
+          <w:tcPr>
+            <w:tcW w:w="3229" w:type="dxa"/>
+          </w:tcPr>
+          <w:p>
+            <w:r>
+              <w:rPr>
+                <w:rFonts w:cs="Arial"/>
+                <w:sz w:val="19"/>
+                <w:szCs w:val="19"/>
+              </w:rPr>
+              <w:t>2026-06-10 13:56:12</w:t>
+            </w:r>
+          </w:p>
+        </w:tc>
+        <w:tc>
+          <w:tcPr>
+            <w:tcW w:w="3567" w:type="dxa"/>
+          </w:tcPr>
+          <w:p>
+            <w:r>
+              <w:rPr>
+                <w:rFonts w:cs="Arial"/>
+                <w:sz w:val="19"/>
+                <w:szCs w:val="19"/>
+              </w:rPr>
+              <w:t>greenhouse/alarm</w:t>
+            </w:r>
+          </w:p>
+        </w:tc>
+        <w:tc>
+          <w:tcPr>
+            <w:tcW w:w="3644" w:type="dxa"/>
+          </w:tcPr>
+          <w:p>
+            <w:r>
+              <w:rPr>
+                <w:rFonts w:cs="Arial"/>
+                <w:sz w:val="19"/>
+                <w:szCs w:val="19"/>
+              </w:rPr>
+              <w:t>1</w:t>
+            </w:r>
+          </w:p>
+        </w:tc>
+      </w:tr>
+    </w:tbl>
+    <w:p>
+      <w:pPr>
+        <w:spacing w:after="120" w:line="259" w:lineRule="auto"/>
+      </w:pPr>
     </w:p>
     <w:p>
       <w:pPr>
@@ -4068,8 +4828,8 @@
       </w:r>
     </w:p>
     <w:sectPr>
-      <w:footerReference w:type="default" r:id="rId10"/>
-      <w:headerReference w:type="default" r:id="rId13"/>
+      <w:headerReference w:type="default" r:id="rId10"/>
+      <w:footerReference w:type="default" r:id="rId11"/>
       <w:pgSz w:w="12240" w:h="15840"/>
       <w:pgMar w:top="936" w:right="1008" w:bottom="936" w:left="1008" w:header="720" w:footer="720" w:gutter="0"/>
       <w:cols w:space="720"/>
@@ -4148,7 +4908,7 @@
 </file>
 
 <file path=word/header1.xml><?xml version="1.0" encoding="utf-8"?>
-<w:hdr xmlns:m="http://schemas.openxmlformats.org/officeDocument/2006/math" xmlns:mc="http://schemas.openxmlformats.org/markup-compatibility/2006" xmlns:mo="http://schemas.microsoft.com/office/mac/office/2008/main" xmlns:mv="urn:schemas-microsoft-com:mac:vml" xmlns:o="urn:schemas-microsoft-com:office:office" xmlns:r="http://schemas.openxmlformats.org/officeDocument/2006/relationships" xmlns:v="urn:schemas-microsoft-com:vml" xmlns:w10="urn:schemas-microsoft-com:office:word" xmlns:w14="http://schemas.microsoft.com/office/word/2010/wordml" xmlns:w="http://schemas.openxmlformats.org/wordprocessingml/2006/main" xmlns:wne="http://schemas.microsoft.com/office/word/2006/wordml" xmlns:wp14="http://schemas.microsoft.com/office/word/2010/wordprocessingDrawing" xmlns:wp="http://schemas.openxmlformats.org/drawingml/2006/wordprocessingDrawing" xmlns:wpc="http://schemas.microsoft.com/office/word/2010/wordprocessingCanvas" xmlns:wpg="http://schemas.microsoft.com/office/word/2010/wordprocessingGroup" xmlns:wpi="http://schemas.microsoft.com/office/word/2010/wordprocessingInk" xmlns:wps="http://schemas.microsoft.com/office/word/2010/wordprocessingShape" mc:Ignorable="w14 wp14">
+<w:hdr xmlns:wpc="http://schemas.microsoft.com/office/word/2010/wordprocessingCanvas" xmlns:cx="http://schemas.microsoft.com/office/drawing/2014/chartex" xmlns:cx1="http://schemas.microsoft.com/office/drawing/2015/9/8/chartex" xmlns:cx2="http://schemas.microsoft.com/office/drawing/2015/10/21/chartex" xmlns:cx3="http://schemas.microsoft.com/office/drawing/2016/5/9/chartex" xmlns:cx4="http://schemas.microsoft.com/office/drawing/2016/5/10/chartex" xmlns:cx5="http://schemas.microsoft.com/office/drawing/2016/5/11/chartex" xmlns:cx6="http://schemas.microsoft.com/office/drawing/2016/5/12/chartex" xmlns:cx7="http://schemas.microsoft.com/office/drawing/2016/5/13/chartex" xmlns:cx8="http://schemas.microsoft.com/office/drawing/2016/5/14/chartex" xmlns:mc="http://schemas.openxmlformats.org/markup-compatibility/2006" xmlns:aink="http://schemas.microsoft.com/office/drawing/2016/ink" xmlns:am3d="http://schemas.microsoft.com/office/drawing/2017/model3d" xmlns:o="urn:schemas-microsoft-com:office:office" xmlns:oel="http://schemas.microsoft.com/office/2019/extlst" xmlns:r="http://schemas.openxmlformats.org/officeDocument/2006/relationships" xmlns:m="http://schemas.openxmlformats.org/officeDocument/2006/math" xmlns:v="urn:schemas-microsoft-com:vml" xmlns:wp14="http://schemas.microsoft.com/office/word/2010/wordprocessingDrawing" xmlns:wp="http://schemas.openxmlformats.org/drawingml/2006/wordprocessingDrawing" xmlns:w10="urn:schemas-microsoft-com:office:word" xmlns:w="http://schemas.openxmlformats.org/wordprocessingml/2006/main" xmlns:w14="http://schemas.microsoft.com/office/word/2010/wordml" xmlns:w15="http://schemas.microsoft.com/office/word/2012/wordml" xmlns:w16cex="http://schemas.microsoft.com/office/word/2018/wordml/cex" xmlns:w16cid="http://schemas.microsoft.com/office/word/2016/wordml/cid" xmlns:w16="http://schemas.microsoft.com/office/word/2018/wordml" xmlns:w16du="http://schemas.microsoft.com/office/word/2023/wordml/word16du" xmlns:w16sdtdh="http://schemas.microsoft.com/office/word/2020/wordml/sdtdatahash" xmlns:w16sdtfl="http://schemas.microsoft.com/office/word/2024/wordml/sdtformatlock" xmlns:w16se="http://schemas.microsoft.com/office/word/2015/wordml/symex" xmlns:wpg="http://schemas.microsoft.com/office/word/2010/wordprocessingGroup" xmlns:wpi="http://schemas.microsoft.com/office/word/2010/wordprocessingInk" xmlns:wne="http://schemas.microsoft.com/office/word/2006/wordml" xmlns:wps="http://schemas.microsoft.com/office/word/2010/wordprocessingShape" mc:Ignorable="w14 w15 w16se w16cid w16 w16cex w16sdtdh w16sdtfl w16du wp14">
   <w:p>
     <w:pPr>
       <w:pStyle w:val="Header"/>

</xml_diff>